<commit_message>
new lab files added
</commit_message>
<xml_diff>
--- a/lab_06_advance_resume.docx
+++ b/lab_06_advance_resume.docx
@@ -18,6 +18,13 @@
       <w:r>
         <w:t xml:space="preserve"> </w:t>
       </w:r>
+    </w:p>
+    <w:p>
+      <w:pPr>
+        <w:spacing w:after="0" w:line="259" w:lineRule="auto"/>
+        <w:ind w:left="0" w:right="70" w:firstLine="0"/>
+        <w:jc w:val="center"/>
+      </w:pPr>
     </w:p>
     <w:p>
       <w:pPr>
@@ -202,10 +209,7 @@
         <w:ind w:left="-5"/>
       </w:pPr>
       <w:r>
-        <w:t xml:space="preserve">EDUCATION </w:t>
-      </w:r>
-      <w:r>
-        <w:t xml:space="preserve"> </w:t>
+        <w:t xml:space="preserve">EDUCATION  </w:t>
       </w:r>
     </w:p>
     <w:p>
@@ -221,10 +225,7 @@
         <w:pStyle w:val="Heading2"/>
       </w:pPr>
       <w:r>
-        <w:t xml:space="preserve">Expected: May 2028 </w:t>
-      </w:r>
-      <w:r>
-        <w:t xml:space="preserve"> </w:t>
+        <w:t xml:space="preserve">Expected: May 2028  </w:t>
       </w:r>
     </w:p>
     <w:p>
@@ -243,10 +244,7 @@
       <w:proofErr w:type="spellEnd"/>
       <w:proofErr w:type="gramEnd"/>
       <w:r>
-        <w:t xml:space="preserve">) in Computer Science &amp; Engineering </w:t>
-      </w:r>
-      <w:r>
-        <w:t xml:space="preserve"> </w:t>
+        <w:t xml:space="preserve">) in Computer Science &amp; Engineering  </w:t>
       </w:r>
     </w:p>
     <w:p>
@@ -265,10 +263,7 @@
         <w:t>7.96</w:t>
       </w:r>
       <w:r>
-        <w:t xml:space="preserve"> / 10 (Semesters 1 &amp; 2) </w:t>
-      </w:r>
-      <w:r>
-        <w:t xml:space="preserve"> </w:t>
+        <w:t xml:space="preserve"> / 10 (Semesters 1 &amp; 2)  </w:t>
       </w:r>
     </w:p>
     <w:p>
@@ -281,10 +276,7 @@
         <w:ind w:right="270" w:hanging="150"/>
       </w:pPr>
       <w:r>
-        <w:t xml:space="preserve">Relevant Academic Coursework: Data Structures &amp; Algorithms, Object-Oriented Programming (Java/C), Database Management Systems (SQL), Computer Programming (C) </w:t>
-      </w:r>
-      <w:r>
-        <w:t xml:space="preserve"> </w:t>
+        <w:t xml:space="preserve">Relevant Academic Coursework: Data Structures &amp; Algorithms, Object-Oriented Programming (Java/C), Database Management Systems (SQL), Computer Programming (C)  </w:t>
       </w:r>
     </w:p>
     <w:p>
@@ -293,10 +285,7 @@
         <w:ind w:left="15" w:firstLine="0"/>
       </w:pPr>
       <w:r>
-        <w:t xml:space="preserve"> </w:t>
-      </w:r>
-      <w:r>
-        <w:t xml:space="preserve"> </w:t>
+        <w:t xml:space="preserve">  </w:t>
       </w:r>
     </w:p>
     <w:p>
@@ -433,10 +422,7 @@
         <w:ind w:right="270" w:hanging="150"/>
       </w:pPr>
       <w:r>
-        <w:t xml:space="preserve">Programming Languages: Java, C </w:t>
-      </w:r>
-      <w:r>
-        <w:t xml:space="preserve"> </w:t>
+        <w:t xml:space="preserve">Programming Languages: Java, C  </w:t>
       </w:r>
     </w:p>
     <w:p>
@@ -449,10 +435,7 @@
         <w:ind w:right="270" w:hanging="150"/>
       </w:pPr>
       <w:r>
-        <w:t xml:space="preserve">Web Stack Technologies: HTML5, CSS3, Bootstrap Framework </w:t>
-      </w:r>
-      <w:r>
-        <w:t xml:space="preserve"> </w:t>
+        <w:t xml:space="preserve">Web Stack Technologies: HTML5, CSS3, Bootstrap Framework  </w:t>
       </w:r>
     </w:p>
     <w:p>
@@ -473,10 +456,7 @@
       </w:r>
       <w:proofErr w:type="gramEnd"/>
       <w:r>
-        <w:t xml:space="preserve">Currently learning) • Developer Tools: Git, GitHub, VS Code </w:t>
-      </w:r>
-      <w:r>
-        <w:t xml:space="preserve"> </w:t>
+        <w:t xml:space="preserve">Currently learning) • Developer Tools: Git, GitHub, VS Code  </w:t>
       </w:r>
     </w:p>
     <w:p>
@@ -485,10 +465,7 @@
         <w:ind w:left="15" w:firstLine="0"/>
       </w:pPr>
       <w:r>
-        <w:t xml:space="preserve"> </w:t>
-      </w:r>
-      <w:r>
-        <w:t xml:space="preserve"> </w:t>
+        <w:t xml:space="preserve">  </w:t>
       </w:r>
     </w:p>
     <w:p>
@@ -763,10 +740,7 @@
         <w:ind w:left="-5"/>
       </w:pPr>
       <w:r>
-        <w:t xml:space="preserve">TECHNICAL PROJECT </w:t>
-      </w:r>
-      <w:r>
-        <w:t xml:space="preserve"> </w:t>
+        <w:t xml:space="preserve">TECHNICAL PROJECT  </w:t>
       </w:r>
     </w:p>
     <w:p>
@@ -795,10 +769,7 @@
         <w:ind w:right="270" w:hanging="360"/>
       </w:pPr>
       <w:r>
-        <w:t xml:space="preserve">Developed a multi-page interactive web application featuring custom navigation menus, structured travel directories, and media galleries. </w:t>
-      </w:r>
-      <w:r>
-        <w:t xml:space="preserve"> </w:t>
+        <w:t xml:space="preserve">Developed a multi-page interactive web application featuring custom navigation menus, structured travel directories, and media galleries.  </w:t>
       </w:r>
     </w:p>
     <w:p>
@@ -810,10 +781,7 @@
         <w:ind w:right="270" w:hanging="360"/>
       </w:pPr>
       <w:r>
-        <w:t xml:space="preserve">Utilized Bootstrap’s mobile-first grid system to ensure seamless, responsive layout rendering across all mobile and desktop viewports. </w:t>
-      </w:r>
-      <w:r>
-        <w:t xml:space="preserve"> </w:t>
+        <w:t xml:space="preserve">Utilized Bootstrap’s mobile-first grid system to ensure seamless, responsive layout rendering across all mobile and desktop viewports.  </w:t>
       </w:r>
     </w:p>
     <w:p>
@@ -825,10 +793,7 @@
         <w:ind w:right="270" w:hanging="360"/>
       </w:pPr>
       <w:r>
-        <w:t xml:space="preserve">Styled components with custom CSS rulesets to create unique button focus states, thematic cards, and clean visual hierarchies. </w:t>
-      </w:r>
-      <w:r>
-        <w:t xml:space="preserve"> </w:t>
+        <w:t xml:space="preserve">Styled components with custom CSS rulesets to create unique button focus states, thematic cards, and clean visual hierarchies.  </w:t>
       </w:r>
     </w:p>
     <w:p>
@@ -853,10 +818,7 @@
         <w:t>.</w:t>
       </w:r>
       <w:r>
-        <w:t xml:space="preserve"> </w:t>
-      </w:r>
-      <w:r>
-        <w:t xml:space="preserve"> </w:t>
+        <w:t xml:space="preserve">  </w:t>
       </w:r>
     </w:p>
     <w:p>
@@ -891,10 +853,7 @@
         <w:ind w:right="270" w:hanging="360"/>
       </w:pPr>
       <w:r>
-        <w:t xml:space="preserve">Engineered a terminal-based Anagram Game logic engine in C utilizing frequency- tracking arrays to validate random user inputs. </w:t>
-      </w:r>
-      <w:r>
-        <w:t xml:space="preserve"> </w:t>
+        <w:t xml:space="preserve">Engineered a terminal-based Anagram Game logic engine in C utilizing frequency- tracking arrays to validate random user inputs.  </w:t>
       </w:r>
     </w:p>
     <w:p>
@@ -914,10 +873,7 @@
       </w:r>
       <w:proofErr w:type="spellEnd"/>
       <w:r>
-        <w:t xml:space="preserve">/time) for distinct puzzle rounds. </w:t>
-      </w:r>
-      <w:r>
-        <w:t xml:space="preserve"> </w:t>
+        <w:t xml:space="preserve">/time) for distinct puzzle rounds.  </w:t>
       </w:r>
     </w:p>
     <w:p>
@@ -929,10 +885,7 @@
         <w:ind w:right="270" w:hanging="360"/>
       </w:pPr>
       <w:r>
-        <w:t>Constructed a real-time command-</w:t>
-      </w:r>
-      <w:r>
-        <w:t xml:space="preserve">line interface using ANSI escape codes for custom </w:t>
+        <w:t xml:space="preserve">Constructed a real-time command-line interface using ANSI escape codes for custom </w:t>
       </w:r>
       <w:proofErr w:type="spellStart"/>
       <w:r>
@@ -940,10 +893,7 @@
       </w:r>
       <w:proofErr w:type="spellEnd"/>
       <w:r>
-        <w:t xml:space="preserve"> text, scoring, and screen-clearing. </w:t>
-      </w:r>
-      <w:r>
-        <w:t xml:space="preserve"> </w:t>
+        <w:t xml:space="preserve"> text, scoring, and screen-clearing.  </w:t>
       </w:r>
     </w:p>
     <w:p>
@@ -955,10 +905,7 @@
         <w:ind w:right="270" w:hanging="360"/>
       </w:pPr>
       <w:r>
-        <w:t xml:space="preserve">Coded core sequential data structures (Linked Lists, Stacks, Queues) from scratch to master pointer and memory management. </w:t>
-      </w:r>
-      <w:r>
-        <w:t xml:space="preserve"> </w:t>
+        <w:t xml:space="preserve">Coded core sequential data structures (Linked Lists, Stacks, Queues) from scratch to master pointer and memory management.  </w:t>
       </w:r>
     </w:p>
     <w:p>
@@ -970,10 +917,7 @@
         <w:ind w:right="270" w:hanging="360"/>
       </w:pPr>
       <w:r>
-        <w:t xml:space="preserve">Formulated relational database schemas and executed custom SQL queries as part of academic database coursework. </w:t>
-      </w:r>
-      <w:r>
-        <w:t xml:space="preserve"> </w:t>
+        <w:t xml:space="preserve">Formulated relational database schemas and executed custom SQL queries as part of academic database coursework.  </w:t>
       </w:r>
     </w:p>
     <w:p>
@@ -982,10 +926,7 @@
         <w:ind w:left="15" w:firstLine="0"/>
       </w:pPr>
       <w:r>
-        <w:t xml:space="preserve"> </w:t>
-      </w:r>
-      <w:r>
-        <w:t xml:space="preserve"> </w:t>
+        <w:t xml:space="preserve">  </w:t>
       </w:r>
     </w:p>
     <w:p>
@@ -1100,10 +1041,7 @@
         <w:ind w:left="-5"/>
       </w:pPr>
       <w:r>
-        <w:t xml:space="preserve">ACADEMIC FOCUS &amp; FOUNDATIONS </w:t>
-      </w:r>
-      <w:r>
-        <w:t xml:space="preserve"> </w:t>
+        <w:t xml:space="preserve">ACADEMIC FOCUS &amp; FOUNDATIONS  </w:t>
       </w:r>
     </w:p>
     <w:p>
@@ -1115,10 +1053,7 @@
         <w:ind w:right="270" w:hanging="360"/>
       </w:pPr>
       <w:r>
-        <w:t xml:space="preserve">Algorithmic Logic: Practicing data manipulation by implementing loops, conditional arrays, and string-parsing algorithms in C. </w:t>
-      </w:r>
-      <w:r>
-        <w:t xml:space="preserve"> </w:t>
+        <w:t xml:space="preserve">Algorithmic Logic: Practicing data manipulation by implementing loops, conditional arrays, and string-parsing algorithms in C.  </w:t>
       </w:r>
     </w:p>
     <w:p>
@@ -1130,10 +1065,7 @@
         <w:ind w:right="270" w:hanging="360"/>
       </w:pPr>
       <w:r>
-        <w:t xml:space="preserve">Software Standards: Writing readable, optimized, and well-commented code structures within engineering laboratory coursework. </w:t>
-      </w:r>
-      <w:r>
-        <w:t xml:space="preserve"> </w:t>
+        <w:t xml:space="preserve">Software Standards: Writing readable, optimized, and well-commented code structures within engineering laboratory coursework.  </w:t>
       </w:r>
     </w:p>
     <w:p>
@@ -1145,10 +1077,7 @@
         <w:ind w:right="270" w:hanging="360"/>
       </w:pPr>
       <w:r>
-        <w:t xml:space="preserve">Relational Databases: Studying fundamental database management structures to understand efficient data storage matrices. </w:t>
-      </w:r>
-      <w:r>
-        <w:t xml:space="preserve"> </w:t>
+        <w:t xml:space="preserve">Relational Databases: Studying fundamental database management structures to understand efficient data storage matrices.  </w:t>
       </w:r>
     </w:p>
     <w:p>
@@ -1157,10 +1086,7 @@
         <w:ind w:left="15" w:firstLine="0"/>
       </w:pPr>
       <w:r>
-        <w:t xml:space="preserve"> </w:t>
-      </w:r>
-      <w:r>
-        <w:t xml:space="preserve"> </w:t>
+        <w:t xml:space="preserve">  </w:t>
       </w:r>
     </w:p>
     <w:sectPr>

</xml_diff>